<commit_message>
Set 3 report: sync numbers/figures/loss descriptions with notebook, UK English, remove em dashes, add GitHub URL
</commit_message>
<xml_diff>
--- a/Set 3/GAN_Assignment_Report_Set 3.docx
+++ b/Set 3/GAN_Assignment_Report_Set 3.docx
@@ -15,7 +15,7 @@
           <w:rFonts w:ascii="Times New Roman" w:hAnsi="Times New Roman"/>
           <w:szCs w:val="40"/>
         </w:rPr>
-        <w:t>7COM1079 Coursework 2 — Building GANs and Applying Them to Retinal, Network-Traffic and Sketch Data</w:t>
+        <w:t>7COM1079 Coursework 2: Building GANs and Applying Them to Retinal, Network-Traffic and Sketch Data</w:t>
       </w:r>
     </w:p>
     <w:p>
@@ -75,7 +75,7 @@
           <w:sz w:val="30"/>
           <w:szCs w:val="30"/>
         </w:rPr>
-        <w:t>Github URL:</w:t>
+        <w:t>Github URL: https://github.com/nithinreddy2003/GAN_Assignments</w:t>
       </w:r>
     </w:p>
     <w:p>
@@ -107,7 +107,7 @@
           <w:rFonts w:ascii="Times New Roman" w:hAnsi="Times New Roman"/>
           <w:sz w:val="20"/>
         </w:rPr>
-        <w:t>This report documents what was built across the notebook, why each design was chosen, and what the experiments showed. Part 1 builds two GANs from scratch on synthetic 2D data and studies an architecture change; Part 2 applies GANs to three contrasting domains — medical imaging, network-security traffic and hand-drawn sketches — each of which stresses the model differently and so justifies a different design. Two frameworks are used deliberately: PyTorch for the from-scratch and sketch work, TensorFlow/Keras for the medical and tabular models. Seeds are fixed (GLOBAL_SEED = 2025, TF_SEED = 2026) so every number below is reproducible.</w:t>
+        <w:t>This report documents what was built across the notebook, why each design was chosen, and what the experiments showed. Part 1 builds two GANs from scratch on synthetic 2D data and studies an architecture change; Part 2 applies GANs to three contrasting domains, medical imaging, network-security traffic and hand-drawn sketches, each of which stresses the model differently and so justifies a different design. Two frameworks are used deliberately: PyTorch for the from-scratch and sketch work, TensorFlow/Keras for the medical and tabular models. Seeds are fixed (GLOBAL_SEED = 2025, TF_SEED_VAL = 2026) so every number below is reproducible.</w:t>
       </w:r>
     </w:p>
     <w:p>
@@ -169,7 +169,7 @@
           <w:rFonts w:ascii="Times New Roman" w:hAnsi="Times New Roman"/>
           <w:sz w:val="20"/>
         </w:rPr>
-        <w:t>2. Part 1 — GANs Built From Scratch on 2D Data</w:t>
+        <w:t>2. Part 1: GANs Built From Scratch on 2D Data</w:t>
       </w:r>
     </w:p>
     <w:p>
@@ -200,7 +200,7 @@
           <w:rFonts w:ascii="Times New Roman" w:hAnsi="Times New Roman"/>
           <w:sz w:val="20"/>
         </w:rPr>
-        <w:t>, 2016; Kingma and Ba, 2015). One configurable pair of classes serves all three tasks, so the Task 3 comparison is fair — only the changed hyper-parameters differ.</w:t>
+        <w:t>, 2016; Kingma and Ba, 2015). One configurable pair of classes serves all three tasks, so the Task 3 comparison is fair, only the changed hyper-parameters differ.</w:t>
       </w:r>
     </w:p>
     <w:p>
@@ -281,7 +281,7 @@
         </w:rPr>
         <w:drawing>
           <wp:inline distT="0" distB="0" distL="0" distR="0" wp14:anchorId="1CB6CDE8" wp14:editId="394C3667">
-            <wp:extent cx="2063386" cy="2105891"/>
+            <wp:extent cx="2150266" cy="2194560"/>
             <wp:effectExtent l="0" t="0" r="0" b="0"/>
             <wp:docPr id="1" name="Picture 1"/>
             <wp:cNvGraphicFramePr>
@@ -303,7 +303,7 @@
                   <pic:spPr>
                     <a:xfrm>
                       <a:off x="0" y="0"/>
-                      <a:ext cx="2083815" cy="2126741"/>
+                      <a:ext cx="2150266" cy="2194560"/>
                     </a:xfrm>
                     <a:prstGeom prst="rect">
                       <a:avLst/>
@@ -349,7 +349,7 @@
           <w:sz w:val="20"/>
         </w:rPr>
         <w:lastRenderedPageBreak/>
-        <w:t>Figure 1 shows the generated cloud lying almost exactly on the curve, and the losses agree: the discriminator settles at 1.35–1.39 (final 1.3796) and the generator at 0.68–0.76 (final 0.6979), close to this objective's equilibrium (≈ 2ln2 = 1.386 for D, ln2 = 0.693 for G). Neither loss runs away, indicating genuine convergence rather than one network dominating.</w:t>
+        <w:t>Figure 1 shows the generated cloud lying almost exactly on the curve, and the losses agree: the discriminator settles at 1.35-1.39 (final 1.3796) and the generator at 0.68-0.76 (final 0.6979), close to this objective's equilibrium (≈ 2ln2 = 1.386 for D, ln2 = 0.693 for G). Neither loss runs away, indicating genuine convergence rather than one network dominating.</w:t>
       </w:r>
     </w:p>
     <w:p>
@@ -426,7 +426,7 @@
           <w:rFonts w:ascii="Times New Roman" w:hAnsi="Times New Roman"/>
           <w:sz w:val="20"/>
         </w:rPr>
-        <w:t>) + ε (ε a small Gaussian noise term) — harder than the sine because of the higher-frequency term and the noise band; 8000 steps.</w:t>
+        <w:t>) + ε (ε a small Gaussian noise term), harder than the sine because of the higher-frequency term and the noise band; 8000 steps.</w:t>
       </w:r>
     </w:p>
     <w:p>
@@ -445,7 +445,7 @@
         </w:rPr>
         <w:drawing>
           <wp:inline distT="0" distB="0" distL="0" distR="0" wp14:anchorId="7A8D78AC" wp14:editId="66608AA2">
-            <wp:extent cx="2895600" cy="2207138"/>
+            <wp:extent cx="2879102" cy="2194560"/>
             <wp:effectExtent l="0" t="0" r="0" b="0"/>
             <wp:docPr id="2" name="Picture 2"/>
             <wp:cNvGraphicFramePr>
@@ -467,7 +467,7 @@
                   <pic:spPr>
                     <a:xfrm>
                       <a:off x="0" y="0"/>
-                      <a:ext cx="2923539" cy="2228434"/>
+                      <a:ext cx="2879102" cy="2194560"/>
                     </a:xfrm>
                     <a:prstGeom prst="rect">
                       <a:avLst/>
@@ -512,7 +512,7 @@
           <w:rFonts w:ascii="Times New Roman" w:hAnsi="Times New Roman"/>
           <w:sz w:val="20"/>
         </w:rPr>
-        <w:t>Figure 2 shows the generator tracing the double-bump shape and spreading its points into the same noisy band as the real data rather than collapsing to a thin line, so it learns the target's variance and not just its mean trend. Losses stay healthy (D 1.1652–1.3705, G 0.7229–0.8429), a little noisier than Task 1 as expected for a more oscillatory target.</w:t>
+        <w:t>Figure 2 shows the generator tracing the double-bump shape and spreading its points into the same noisy band as the real data rather than collapsing to a thin line, so it learns the target's variance and not just its mean trend. Losses stay healthy (D 1.1652-1.3705, G 0.7229-0.8429), a little noisier than Task 1 as expected for a more oscillatory target.</w:t>
       </w:r>
     </w:p>
     <w:p>
@@ -563,7 +563,7 @@
         </w:rPr>
         <w:drawing>
           <wp:inline distT="0" distB="0" distL="0" distR="0" wp14:anchorId="6AD98871" wp14:editId="7876A131">
-            <wp:extent cx="4450080" cy="2378709"/>
+            <wp:extent cx="4105575" cy="2194560"/>
             <wp:effectExtent l="0" t="0" r="0" b="0"/>
             <wp:docPr id="3" name="Picture 3"/>
             <wp:cNvGraphicFramePr>
@@ -585,7 +585,7 @@
                   <pic:spPr>
                     <a:xfrm>
                       <a:off x="0" y="0"/>
-                      <a:ext cx="4493316" cy="2401820"/>
+                      <a:ext cx="4105575" cy="2194560"/>
                     </a:xfrm>
                     <a:prstGeom prst="rect">
                       <a:avLst/>
@@ -631,7 +631,7 @@
           <w:sz w:val="20"/>
         </w:rPr>
         <w:lastRenderedPageBreak/>
-        <w:t>Figure 3 shows a visible but modest gain: the deeper ELU generator sits slightly tighter around the curve with fewer stray points, and its losses stay stable (final D 1.3821, G 0.7089), so the added depth caused no optimisation trouble. That the gain is small is itself informative — a 2D curve is simple enough that the shallow baseline already captures most of the structure.</w:t>
+        <w:t>Figure 3 shows a visible but modest gain: the deeper ELU generator sits slightly tighter around the curve with fewer stray points, and its losses stay stable (final D 1.3821, G 0.7089), so the added depth caused no optimisation trouble. That the gain is small is itself informative, a 2D curve is simple enough that the shallow baseline already captures most of the structure.</w:t>
       </w:r>
     </w:p>
     <w:p>
@@ -647,7 +647,7 @@
           <w:rFonts w:ascii="Times New Roman" w:hAnsi="Times New Roman"/>
           <w:sz w:val="20"/>
         </w:rPr>
-        <w:t>3. Part 2 — Applying GANs to Three Real-World Domains</w:t>
+        <w:t>3. Part 2: Applying GANs to Three Real-World Domains</w:t>
       </w:r>
     </w:p>
     <w:p>
@@ -702,7 +702,7 @@
           <w:rFonts w:ascii="Times New Roman" w:hAnsi="Times New Roman"/>
           <w:sz w:val="20"/>
         </w:rPr>
-        <w:t xml:space="preserve">, 2023) provides 97,477 training scans of 28×28 pixels in four diagnostic classes (choroidal neovascularisation, diabetic macular edema, drusen, normal), rescaled to 32×32 in [−1, 1] to match the generator's tanh. A DCGAN (Radford </w:t>
+        <w:t xml:space="preserve">, 2023) provides 97,477 training scans of 28×28 pixels in four diagnostic classes (choroidal neovascularisation, diabetic macular oedema, drusen, normal), rescaled to 32×32 in [-1, 1] to match the generator's tanh. A DCGAN (Radford </w:t>
       </w:r>
       <w:r>
         <w:rPr>
@@ -717,7 +717,7 @@
           <w:rFonts w:ascii="Times New Roman" w:hAnsi="Times New Roman"/>
           <w:sz w:val="20"/>
         </w:rPr>
-        <w:t xml:space="preserve">, 2016) suits the strong local structure of a scan — a curved retinal band on a dark background — which convolutions capture far more efficiently than a dense network. The generator upsamples a 100-D latent vector via transposed convolutions; the discriminator mirrors it with strided convolutions and 0.3 dropout. Training used a manual tf.GradientTape loop for 35 epochs with one-sided label smoothing (real labels 0.9), which stops the discriminator over-confidently starving the generator of gradient (Salimans </w:t>
+        <w:t xml:space="preserve">, 2016) suits the strong local structure of a scan, a curved retinal band on a dark background, which convolutions capture far more efficiently than a dense network. The generator upsamples a 100-D latent vector via transposed convolutions; the discriminator mirrors it with strided convolutions and 0.3 dropout. Training used a manual tf.GradientTape loop for 35 epochs with one-sided label smoothing (real labels 0.9), which stops the discriminator over-confidently starving the generator of gradient (Salimans </w:t>
       </w:r>
       <w:r>
         <w:rPr>
@@ -751,7 +751,7 @@
         </w:rPr>
         <w:drawing>
           <wp:inline distT="0" distB="0" distL="0" distR="0" wp14:anchorId="5817FED0" wp14:editId="777E6D93">
-            <wp:extent cx="3870960" cy="2194295"/>
+            <wp:extent cx="3871429" cy="2194560"/>
             <wp:effectExtent l="0" t="0" r="0" b="0"/>
             <wp:docPr id="4" name="Picture 4"/>
             <wp:cNvGraphicFramePr>
@@ -773,7 +773,7 @@
                   <pic:spPr>
                     <a:xfrm>
                       <a:off x="0" y="0"/>
-                      <a:ext cx="3885700" cy="2202650"/>
+                      <a:ext cx="3871429" cy="2194560"/>
                     </a:xfrm>
                     <a:prstGeom prst="rect">
                       <a:avLst/>
@@ -837,7 +837,7 @@
         </w:rPr>
         <w:drawing>
           <wp:inline distT="0" distB="0" distL="0" distR="0" wp14:anchorId="6562A987" wp14:editId="4E8EA056">
-            <wp:extent cx="3535680" cy="2000652"/>
+            <wp:extent cx="3878366" cy="2194560"/>
             <wp:effectExtent l="0" t="0" r="0" b="0"/>
             <wp:docPr id="5" name="Picture 5"/>
             <wp:cNvGraphicFramePr>
@@ -859,7 +859,7 @@
                   <pic:spPr>
                     <a:xfrm>
                       <a:off x="0" y="0"/>
-                      <a:ext cx="3567707" cy="2018775"/>
+                      <a:ext cx="3878366" cy="2194560"/>
                     </a:xfrm>
                     <a:prstGeom prst="rect">
                       <a:avLst/>
@@ -904,7 +904,7 @@
           <w:rFonts w:ascii="Times New Roman" w:hAnsi="Times New Roman"/>
           <w:sz w:val="20"/>
         </w:rPr>
-        <w:t>Figure 5 shows neither network diverging — the discriminator holds around 1.1–1.34 and the generator around 0.75–1.28, oscillating within a stable band. That stability is what makes the sample quality below meaningful rather than accidental.</w:t>
+        <w:t>Figure 5 shows neither network diverging, the discriminator stays around 0.9 to 1.55 and the generator around 0.4 to 1.66, oscillating within a stable band. That stability is what makes the sample quality below meaningful rather than accidental.</w:t>
       </w:r>
     </w:p>
     <w:p>
@@ -924,7 +924,7 @@
         <w:lastRenderedPageBreak/>
         <w:drawing>
           <wp:inline distT="0" distB="0" distL="0" distR="0" wp14:anchorId="6C2C4DCF" wp14:editId="462D2D2C">
-            <wp:extent cx="5394448" cy="1530927"/>
+            <wp:extent cx="4206240" cy="1841890"/>
             <wp:effectExtent l="0" t="0" r="0" b="0"/>
             <wp:docPr id="6" name="Picture 6"/>
             <wp:cNvGraphicFramePr>
@@ -947,7 +947,7 @@
                   <pic:spPr bwMode="auto">
                     <a:xfrm>
                       <a:off x="0" y="0"/>
-                      <a:ext cx="5394960" cy="1531072"/>
+                      <a:ext cx="4206240" cy="1841890"/>
                     </a:xfrm>
                     <a:prstGeom prst="rect">
                       <a:avLst/>
@@ -1000,7 +1000,7 @@
           <w:rFonts w:ascii="Times New Roman" w:hAnsi="Times New Roman"/>
           <w:sz w:val="20"/>
         </w:rPr>
-        <w:t xml:space="preserve">Figure 6 shows the generator reproduces the main anatomy with real variation in band position and curvature, so it is not memorising one image; its weakness is fine detail — the fakes are softer and lose sub-layer texture and speckle. It scores </w:t>
+        <w:t xml:space="preserve">Figure 6 shows the generator reproduces the main anatomy with real variation in band position and curvature, so it is not memorising one image; its weakness is fine detail, the fakes are softer and lose sub-layer texture and speckle. It scores </w:t>
       </w:r>
       <w:r>
         <w:rPr>
@@ -1008,7 +1008,7 @@
           <w:b/>
           <w:sz w:val="20"/>
         </w:rPr>
-        <w:t>FID = 39.20</w:t>
+        <w:t>FID = 39.23</w:t>
       </w:r>
       <w:r>
         <w:rPr>
@@ -1030,7 +1030,7 @@
           <w:rFonts w:ascii="Times New Roman" w:hAnsi="Times New Roman"/>
           <w:sz w:val="20"/>
         </w:rPr>
-        <w:t xml:space="preserve">, 2017), a believable mid-range value for a 35-epoch DCGAN, though read cautiously: FID passes 28×28 grayscale (upscaled) through an ImageNet-trained InceptionV3 (Szegedy </w:t>
+        <w:t xml:space="preserve">, 2017), a believable mid-range value for a 35-epoch DCGAN, though read cautiously: FID passes 28×28 greyscale (upscaled) through an ImageNet-trained InceptionV3 (Szegedy </w:t>
       </w:r>
       <w:r>
         <w:rPr>
@@ -1062,7 +1062,7 @@
           <w:b/>
           <w:sz w:val="20"/>
         </w:rPr>
-        <w:t>Extension — conditional GAN.</w:t>
+        <w:t>Extension: conditional GAN.</w:t>
       </w:r>
       <w:r>
         <w:rPr>
@@ -1088,7 +1088,7 @@
         </w:rPr>
         <w:drawing>
           <wp:inline distT="0" distB="0" distL="0" distR="0" wp14:anchorId="15A55358" wp14:editId="189774A3">
-            <wp:extent cx="4128654" cy="2257857"/>
+            <wp:extent cx="4012910" cy="2194560"/>
             <wp:effectExtent l="0" t="0" r="0" b="0"/>
             <wp:docPr id="7" name="Picture 7"/>
             <wp:cNvGraphicFramePr>
@@ -1110,7 +1110,7 @@
                   <pic:spPr>
                     <a:xfrm>
                       <a:off x="0" y="0"/>
-                      <a:ext cx="4161158" cy="2275632"/>
+                      <a:ext cx="4012910" cy="2194560"/>
                     </a:xfrm>
                     <a:prstGeom prst="rect">
                       <a:avLst/>
@@ -1155,7 +1155,7 @@
           <w:rFonts w:ascii="Times New Roman" w:hAnsi="Times New Roman"/>
           <w:sz w:val="20"/>
         </w:rPr>
-        <w:t>Figure 7 shows visibly different scans per row, so the label steers the output rather than being ignored; better-represented classes look sharper — the direct effect of the imbalance in Figure 4.</w:t>
+        <w:t>Figure 7 shows visibly different scans per row, so the label steers the output rather than being ignored; better-represented classes look sharper, the direct effect of the imbalance in Figure 4.</w:t>
       </w:r>
     </w:p>
     <w:p>
@@ -1179,7 +1179,7 @@
           <w:rFonts w:ascii="Times New Roman" w:hAnsi="Times New Roman"/>
           <w:sz w:val="20"/>
         </w:rPr>
-        <w:t xml:space="preserve"> The duck test — if it looks and quacks like a duck, assume it is one — captures a real risk here. The discriminator only judges whether an image </w:t>
+        <w:t xml:space="preserve"> The duck test, if it looks and quacks like a duck, assume it is one, captures a real risk here. The discriminator only judges whether an image </w:t>
       </w:r>
       <w:r>
         <w:rPr>
@@ -1279,7 +1279,7 @@
           <w:rFonts w:ascii="Times New Roman" w:hAnsi="Times New Roman"/>
           <w:sz w:val="20"/>
         </w:rPr>
-        <w:t>). Because each flow is a feature vector, a dense GAN replaces the DCGAN — there is no spatial axis for convolutions. The generator widens 128→256 (batch norm, ReLU) ending in a linear layer (standardised features are unbounded, so no tanh); the discriminator narrows 256→128 (LeakyReLU, dropout). Latent dimension 48, 60 epochs.</w:t>
+        <w:t>). Because each flow is a feature vector, a dense GAN replaces the DCGAN, there is no spatial axis for convolutions. The generator widens 128→256 (batch norm, ReLU) ending in a linear layer (standardised features are unbounded, so no tanh); the discriminator narrows 256→128 (LeakyReLU, dropout). Latent dimension 48, 60 epochs.</w:t>
       </w:r>
     </w:p>
     <w:p>
@@ -1299,7 +1299,7 @@
         <w:lastRenderedPageBreak/>
         <w:drawing>
           <wp:inline distT="0" distB="0" distL="0" distR="0" wp14:anchorId="45358A1F" wp14:editId="32009B43">
-            <wp:extent cx="5394960" cy="1413051"/>
+            <wp:extent cx="4206240" cy="1101702"/>
             <wp:effectExtent l="0" t="0" r="0" b="0"/>
             <wp:docPr id="8" name="Picture 8"/>
             <wp:cNvGraphicFramePr>
@@ -1321,7 +1321,7 @@
                   <pic:spPr>
                     <a:xfrm>
                       <a:off x="0" y="0"/>
-                      <a:ext cx="5394960" cy="1413051"/>
+                      <a:ext cx="4206240" cy="1101702"/>
                     </a:xfrm>
                     <a:prstGeom prst="rect">
                       <a:avLst/>
@@ -1400,7 +1400,7 @@
         </w:rPr>
         <w:drawing>
           <wp:inline distT="0" distB="0" distL="0" distR="0" wp14:anchorId="5C511535" wp14:editId="0D6D8D65">
-            <wp:extent cx="3825240" cy="2164498"/>
+            <wp:extent cx="3878366" cy="2194560"/>
             <wp:effectExtent l="0" t="0" r="0" b="0"/>
             <wp:docPr id="9" name="Picture 9"/>
             <wp:cNvGraphicFramePr>
@@ -1422,7 +1422,7 @@
                   <pic:spPr>
                     <a:xfrm>
                       <a:off x="0" y="0"/>
-                      <a:ext cx="3843068" cy="2174586"/>
+                      <a:ext cx="3878366" cy="2194560"/>
                     </a:xfrm>
                     <a:prstGeom prst="rect">
                       <a:avLst/>
@@ -1467,7 +1467,7 @@
           <w:rFonts w:ascii="Times New Roman" w:hAnsi="Times New Roman"/>
           <w:sz w:val="20"/>
         </w:rPr>
-        <w:t>Figure 9 shows stable training: the discriminator drifts from about 1.13 to 0.87 while the generator rises from about 1.11 to 1.73 — a rising generator loss against a controlled discriminator, typical of a dense GAN settling.</w:t>
+        <w:t>Figure 9 shows stable training: the discriminator holds around 0.90 to 0.99 while the generator rises from about 1.60 to 1.88, a rising generator loss against a controlled discriminator, typical of a dense GAN settling.</w:t>
       </w:r>
     </w:p>
     <w:p>
@@ -1486,7 +1486,7 @@
         </w:rPr>
         <w:drawing>
           <wp:inline distT="0" distB="0" distL="0" distR="0" wp14:anchorId="0BAB3DBB" wp14:editId="62992216">
-            <wp:extent cx="3129933" cy="2773680"/>
+            <wp:extent cx="2464350" cy="2194560"/>
             <wp:effectExtent l="0" t="0" r="0" b="0"/>
             <wp:docPr id="10" name="Picture 10"/>
             <wp:cNvGraphicFramePr>
@@ -1508,7 +1508,7 @@
                   <pic:spPr>
                     <a:xfrm>
                       <a:off x="0" y="0"/>
-                      <a:ext cx="3135514" cy="2778626"/>
+                      <a:ext cx="2464350" cy="2194560"/>
                     </a:xfrm>
                     <a:prstGeom prst="rect">
                       <a:avLst/>
@@ -1557,7 +1557,7 @@
         <w:lastRenderedPageBreak/>
         <w:drawing>
           <wp:inline distT="0" distB="0" distL="0" distR="0" wp14:anchorId="1BA615A8" wp14:editId="5B2030A7">
-            <wp:extent cx="5135880" cy="4507335"/>
+            <wp:extent cx="2500590" cy="2194560"/>
             <wp:effectExtent l="0" t="0" r="0" b="0"/>
             <wp:docPr id="11" name="Picture 11"/>
             <wp:cNvGraphicFramePr>
@@ -1579,7 +1579,7 @@
                   <pic:spPr>
                     <a:xfrm>
                       <a:off x="0" y="0"/>
-                      <a:ext cx="5168076" cy="4535591"/>
+                      <a:ext cx="2500590" cy="2194560"/>
                     </a:xfrm>
                     <a:prstGeom prst="rect">
                       <a:avLst/>
@@ -1624,7 +1624,7 @@
           <w:rFonts w:ascii="Times New Roman" w:hAnsi="Times New Roman"/>
           <w:sz w:val="20"/>
         </w:rPr>
-        <w:t xml:space="preserve">Figures 10 and 11 agree: in both the linear PCA and non-linear t-SNE views (van der Maaten and Hinton, 2008) the synthetic points sit inside the main mass of real traffic rather than forming a separate blob, so the generator found the right region of feature space. However, the synthetic cloud is tighter than the real one and misses the tails. The alignment gaps quantify this — mean absolute per-feature error of </w:t>
+        <w:t xml:space="preserve">Figures 10 and 11 agree: in both the linear PCA and non-linear t-SNE views (van der Maaten and Hinton, 2008) the synthetic points sit inside the main mass of real traffic rather than forming a separate blob, so the generator found the right region of feature space. However, the synthetic cloud is tighter than the real one and misses the tails. The alignment gaps quantify this, mean absolute per-feature error of </w:t>
       </w:r>
       <w:r>
         <w:rPr>
@@ -1632,7 +1632,7 @@
           <w:b/>
           <w:sz w:val="20"/>
         </w:rPr>
-        <w:t>0.1227</w:t>
+        <w:t>0.1576</w:t>
       </w:r>
       <w:r>
         <w:rPr>
@@ -1647,14 +1647,14 @@
           <w:b/>
           <w:sz w:val="20"/>
         </w:rPr>
-        <w:t>0.2780</w:t>
-      </w:r>
-      <w:r>
-        <w:rPr>
-          <w:rFonts w:ascii="Times New Roman" w:hAnsi="Times New Roman"/>
-          <w:sz w:val="20"/>
-        </w:rPr>
-        <w:t xml:space="preserve"> for standard deviations — so averages are matched well but spread is understated.</w:t>
+        <w:t>0.2067</w:t>
+      </w:r>
+      <w:r>
+        <w:rPr>
+          <w:rFonts w:ascii="Times New Roman" w:hAnsi="Times New Roman"/>
+          <w:sz w:val="20"/>
+        </w:rPr>
+        <w:t xml:space="preserve"> for standard deviations, so averages are matched well but spread is understated.</w:t>
       </w:r>
     </w:p>
     <w:p>
@@ -1671,7 +1671,7 @@
           <w:b/>
           <w:sz w:val="20"/>
         </w:rPr>
-        <w:t>Extension — full multi-day dataset.</w:t>
+        <w:t>Extension: full multi-day dataset.</w:t>
       </w:r>
       <w:r>
         <w:rPr>
@@ -1701,7 +1701,7 @@
           <w:b/>
           <w:sz w:val="20"/>
         </w:rPr>
-        <w:t>0.1059</w:t>
+        <w:t>0.1300</w:t>
       </w:r>
       <w:r>
         <w:rPr>
@@ -1716,14 +1716,14 @@
           <w:b/>
           <w:sz w:val="20"/>
         </w:rPr>
-        <w:t>0.2669</w:t>
-      </w:r>
-      <w:r>
-        <w:rPr>
-          <w:rFonts w:ascii="Times New Roman" w:hAnsi="Times New Roman"/>
-          <w:sz w:val="20"/>
-        </w:rPr>
-        <w:t xml:space="preserve"> versus 0.1227 / 0.2780). A single unconditional generator would usually fit worse across many attack families, so the extra data volume appears to offset the added diversity; the model still leans towards BENIGN and the high-volume attacks, and the rare classes stay under-represented. Note the brief's "DDoS" label — Wednesday's attacks are single-source DoS, and true DDoS only appears in the Friday file, which is included here.</w:t>
+        <w:t>0.1483</w:t>
+      </w:r>
+      <w:r>
+        <w:rPr>
+          <w:rFonts w:ascii="Times New Roman" w:hAnsi="Times New Roman"/>
+          <w:sz w:val="20"/>
+        </w:rPr>
+        <w:t xml:space="preserve"> versus 0.1576 / 0.2067). A single unconditional generator would usually fit worse across many attack families, so the extra data volume appears to offset the added diversity; the model still leans towards BENIGN and the high-volume attacks, and the rare classes stay under-represented. Note the brief's "DDoS" label, Wednesday's attacks are single-source DoS, and true DDoS only appears in the Friday file, which is included here.</w:t>
       </w:r>
     </w:p>
     <w:p>
@@ -1747,7 +1747,7 @@
           <w:rFonts w:ascii="Times New Roman" w:hAnsi="Times New Roman"/>
           <w:sz w:val="20"/>
         </w:rPr>
-        <w:t xml:space="preserve"> The duck test bites harder on tabular data: a generated flow only has to look statistically like traffic, not behave like a real attack. Used to augment an intrusion-detection set, a fake "attack" matching no real signature could teach the wrong pattern and miss real attacks, while a drifting "benign" row could raise false alarms. Since 78 numbers cannot be eyeballed like an image, the per-feature gaps — especially the standard-deviation gap where such drift shows first — are the main safeguard.</w:t>
+        <w:t xml:space="preserve"> The duck test bites harder on tabular data: a generated flow only has to look statistically like traffic, not behave like a real attack. Used to augment an intrusion-detection set, a fake "attack" matching no real signature could teach the wrong pattern and miss real attacks, while a drifting "benign" row could raise false alarms. Since 78 numbers cannot be eyeballed like an image, the per-feature gaps, especially the standard-deviation gap where such drift shows first, are the main safeguard.</w:t>
       </w:r>
     </w:p>
     <w:p>
@@ -1852,7 +1852,7 @@
         <w:lastRenderedPageBreak/>
         <w:drawing>
           <wp:inline distT="0" distB="0" distL="0" distR="0" wp14:anchorId="17D029F5" wp14:editId="56CC8C0E">
-            <wp:extent cx="5379292" cy="1514475"/>
+            <wp:extent cx="4206240" cy="1846318"/>
             <wp:effectExtent l="0" t="0" r="0" b="0"/>
             <wp:docPr id="12" name="Picture 12"/>
             <wp:cNvGraphicFramePr>
@@ -1875,7 +1875,7 @@
                   <pic:spPr bwMode="auto">
                     <a:xfrm>
                       <a:off x="0" y="0"/>
-                      <a:ext cx="5379719" cy="1514595"/>
+                      <a:ext cx="4206240" cy="1846318"/>
                     </a:xfrm>
                     <a:prstGeom prst="rect">
                       <a:avLst/>
@@ -1928,7 +1928,7 @@
           <w:rFonts w:ascii="Times New Roman" w:hAnsi="Times New Roman"/>
           <w:sz w:val="20"/>
         </w:rPr>
-        <w:t xml:space="preserve">Figure 12 shows the generated cakes are clearly recognisable — a body shape with candle-like marks on top, some with a plate or base line — though a few have broken strokes or speckle. The silhouette is consistent across the grid with no mode collapse. Training was stable apart from a brief epoch-13 spike (D 1.633, G 11.493) that recovered, and it scored </w:t>
+        <w:t xml:space="preserve">Figure 12 shows the generated cakes are clearly recognisable, a body shape with candle-like marks on top, some with a plate or base line, though a few have broken strokes or speckle. The silhouette is consistent across the grid with no mode collapse. Training was stable apart from a brief epoch-13 spike (D 1.633, G 11.493) that recovered, and it scored </w:t>
       </w:r>
       <w:r>
         <w:rPr>
@@ -1960,7 +1960,7 @@
           <w:b/>
           <w:sz w:val="20"/>
         </w:rPr>
-        <w:t>Extension — other categories and complexity.</w:t>
+        <w:t>Extension: other categories and complexity.</w:t>
       </w:r>
       <w:r>
         <w:rPr>
@@ -2016,7 +2016,7 @@
         </w:rPr>
         <w:drawing>
           <wp:inline distT="0" distB="0" distL="0" distR="0" wp14:anchorId="4C21B539" wp14:editId="1A22D8A7">
-            <wp:extent cx="3642360" cy="1576988"/>
+            <wp:extent cx="4206240" cy="1821125"/>
             <wp:effectExtent l="0" t="0" r="0" b="0"/>
             <wp:docPr id="13" name="Picture 13"/>
             <wp:cNvGraphicFramePr>
@@ -2038,7 +2038,7 @@
                   <pic:spPr>
                     <a:xfrm>
                       <a:off x="0" y="0"/>
-                      <a:ext cx="3649459" cy="1580062"/>
+                      <a:ext cx="4206240" cy="1821125"/>
                     </a:xfrm>
                     <a:prstGeom prst="rect">
                       <a:avLst/>
@@ -2128,7 +2128,7 @@
           <w:rFonts w:ascii="Times New Roman" w:hAnsi="Times New Roman"/>
           <w:sz w:val="20"/>
         </w:rPr>
-        <w:t>). The sparsest category (house) is the easiest, supporting the idea that emptier sketches are simpler; but cat and cake have near-identical ink density while cat scores worse, so ink alone does not explain difficulty. Cat sketches vary far more in pose and detail (ears, whiskers, body angle), and it is that structural variety — not ink volume — that makes the category harder.</w:t>
+        <w:t>). The sparsest category (house) is the easiest, supporting the idea that emptier sketches are simpler; but cat and cake have near-identical ink density while cat scores worse, so ink alone does not explain difficulty. Cat sketches vary far more in pose and detail (ears, whiskers, body angle), and it is that structural variety, not ink volume, that makes the category harder.</w:t>
       </w:r>
     </w:p>
     <w:p>
@@ -2160,23 +2160,23 @@
           <w:rFonts w:ascii="Times New Roman" w:hAnsi="Times New Roman"/>
           <w:sz w:val="20"/>
         </w:rPr>
-        <w:t>The same non-saturating objective was applied throughout, but the architecture was matched to the data each time: dense MLPs for 2D points and tabular traffic, convolutional DCGANs for images and sketches, and a conditional variant for class control. The from-scratch models reached near-theoretical equilibria; the DCGANs produced recognisable OCT scans (FID 39.20) and cake sketches (FID 34.29); and the tabular GAN placed synthetic flows within the real distribution (gaps 0.1227 / 0.2780, improving to 0.1059 / 0.2669 across all days). The recurring limitation is under-dispersion — central tendency is reproduced more faithfully than variance and fine detail — together with uneven quality on rare classes.</w:t>
-      </w:r>
-    </w:p>
-    <w:p>
-      <w:pPr>
-        <w:jc w:val="both"/>
-        <w:rPr>
-          <w:rFonts w:ascii="Times New Roman" w:hAnsi="Times New Roman"/>
-          <w:sz w:val="20"/>
-        </w:rPr>
-      </w:pPr>
-      <w:r>
-        <w:rPr>
-          <w:rFonts w:ascii="Times New Roman" w:hAnsi="Times New Roman"/>
-          <w:sz w:val="20"/>
-        </w:rPr>
-        <w:t>Future work follows from these weaknesses: conditioning the CICIDS generator on attack family (as done for OCT) would help it serve rare classes rather than defaulting to BENIGN; a Wasserstein objective with gradient penalty should improve tail coverage and the std-gap; and a domain-appropriate feature extractor would give a fairer image score than ImageNet InceptionV3. Above all, the duck-test analysis means any downstream use of this synthetic data — medical augmentation or intrusion-detection training — must be validated against real-only data before it is trusted.</w:t>
+        <w:t>The same non-saturating objective was applied throughout, but the architecture was matched to the data each time: dense MLPs for 2D points and tabular traffic, convolutional DCGANs for images and sketches, and a conditional variant for class control. The from-scratch models reached near-theoretical equilibria; the DCGANs produced recognisable OCT scans (FID 39.23) and cake sketches (FID 34.29); and the tabular GAN placed synthetic flows within the real distribution (gaps 0.1576 / 0.2067, improving to 0.1300 / 0.1483 across all days). The recurring limitation is under-dispersion, central tendency is reproduced more faithfully than variance and fine detail, together with uneven quality on rare classes.</w:t>
+      </w:r>
+    </w:p>
+    <w:p>
+      <w:pPr>
+        <w:jc w:val="both"/>
+        <w:rPr>
+          <w:rFonts w:ascii="Times New Roman" w:hAnsi="Times New Roman"/>
+          <w:sz w:val="20"/>
+        </w:rPr>
+      </w:pPr>
+      <w:r>
+        <w:rPr>
+          <w:rFonts w:ascii="Times New Roman" w:hAnsi="Times New Roman"/>
+          <w:sz w:val="20"/>
+        </w:rPr>
+        <w:t>Future work follows from these weaknesses: conditioning the CICIDS generator on attack family (as done for OCT) would help it serve rare classes rather than defaulting to BENIGN; a Wasserstein objective with gradient penalty should improve tail coverage and the std-gap; and a domain-appropriate feature extractor would give a fairer image score than ImageNet InceptionV3. Above all, the duck-test analysis means any downstream use of this synthetic data, medical augmentation or intrusion-detection training, must be validated against real-only data before it is trusted.</w:t>
       </w:r>
     </w:p>
     <w:p>
@@ -2224,7 +2224,7 @@
           <w:rFonts w:ascii="Times New Roman" w:hAnsi="Times New Roman"/>
           <w:sz w:val="20"/>
         </w:rPr>
-        <w:t>, 27, pp. 2672–2680.</w:t>
+        <w:t>, 27, pp. 2672-2680.</w:t>
       </w:r>
     </w:p>
     <w:p>
@@ -2286,7 +2286,7 @@
           <w:rFonts w:ascii="Times New Roman" w:hAnsi="Times New Roman"/>
           <w:sz w:val="20"/>
         </w:rPr>
-        <w:t>, 30, pp. 6626–6637.</w:t>
+        <w:t>, 30, pp. 6626-6637.</w:t>
       </w:r>
     </w:p>
     <w:p>
@@ -2410,7 +2410,7 @@
           <w:rFonts w:ascii="Times New Roman" w:hAnsi="Times New Roman"/>
           <w:sz w:val="20"/>
         </w:rPr>
-        <w:t>, 29, pp. 2234–2242.</w:t>
+        <w:t>, 29, pp. 2234-2242.</w:t>
       </w:r>
     </w:p>
     <w:p>
@@ -2441,7 +2441,7 @@
           <w:rFonts w:ascii="Times New Roman" w:hAnsi="Times New Roman"/>
           <w:sz w:val="20"/>
         </w:rPr>
-        <w:t>, pp. 108–116.</w:t>
+        <w:t>, pp. 108-116.</w:t>
       </w:r>
     </w:p>
     <w:p>
@@ -2472,7 +2472,7 @@
           <w:rFonts w:ascii="Times New Roman" w:hAnsi="Times New Roman"/>
           <w:sz w:val="20"/>
         </w:rPr>
-        <w:t>, pp. 2818–2826.</w:t>
+        <w:t>, pp. 2818-2826.</w:t>
       </w:r>
     </w:p>
     <w:p>
@@ -2503,23 +2503,23 @@
           <w:rFonts w:ascii="Times New Roman" w:hAnsi="Times New Roman"/>
           <w:sz w:val="20"/>
         </w:rPr>
-        <w:t>, 9, pp. 2579–2605.</w:t>
-      </w:r>
-    </w:p>
-    <w:p>
-      <w:pPr>
-        <w:jc w:val="both"/>
-        <w:rPr>
-          <w:rFonts w:ascii="Times New Roman" w:hAnsi="Times New Roman"/>
-          <w:sz w:val="20"/>
-        </w:rPr>
-      </w:pPr>
-      <w:r>
-        <w:rPr>
-          <w:rFonts w:ascii="Times New Roman" w:hAnsi="Times New Roman"/>
-          <w:sz w:val="20"/>
-        </w:rPr>
-        <w:t xml:space="preserve">Yang, J., Shi, R., Wei, D., Liu, Z., Zhao, L., Ke, B., Pfister, H. and Ni, B. (2023) 'MedMNIST v2 — a large-scale lightweight benchmark for 2D and 3D biomedical image classification', </w:t>
+        <w:t>, 9, pp. 2579-2605.</w:t>
+      </w:r>
+    </w:p>
+    <w:p>
+      <w:pPr>
+        <w:jc w:val="both"/>
+        <w:rPr>
+          <w:rFonts w:ascii="Times New Roman" w:hAnsi="Times New Roman"/>
+          <w:sz w:val="20"/>
+        </w:rPr>
+      </w:pPr>
+      <w:r>
+        <w:rPr>
+          <w:rFonts w:ascii="Times New Roman" w:hAnsi="Times New Roman"/>
+          <w:sz w:val="20"/>
+        </w:rPr>
+        <w:t xml:space="preserve">Yang, J., Shi, R., Wei, D., Liu, Z., Zhao, L., Ke, B., Pfister, H. and Ni, B. (2023) 'MedMNIST v2 - a large-scale lightweight benchmark for 2D and 3D biomedical image classification', </w:t>
       </w:r>
       <w:r>
         <w:rPr>

</xml_diff>

<commit_message>
Set 3 report: sentence-case headings, remove bold run-ins and negative parallelisms for AI-writing-rule compliance
</commit_message>
<xml_diff>
--- a/Set 3/GAN_Assignment_Report_Set 3.docx
+++ b/Set 3/GAN_Assignment_Report_Set 3.docx
@@ -91,7 +91,7 @@
           <w:rFonts w:ascii="Times New Roman" w:hAnsi="Times New Roman"/>
           <w:sz w:val="20"/>
         </w:rPr>
-        <w:t>1. Overview and Aims</w:t>
+        <w:t>1. Overview and aims</w:t>
       </w:r>
     </w:p>
     <w:p>
@@ -123,37 +123,7 @@
           <w:rFonts w:ascii="Times New Roman" w:hAnsi="Times New Roman"/>
           <w:sz w:val="20"/>
         </w:rPr>
-        <w:t xml:space="preserve">Every model rests on the adversarial idea of Goodfellow </w:t>
-      </w:r>
-      <w:r>
-        <w:rPr>
-          <w:rFonts w:ascii="Times New Roman" w:hAnsi="Times New Roman"/>
-          <w:i/>
-          <w:sz w:val="20"/>
-        </w:rPr>
-        <w:t>et al.</w:t>
-      </w:r>
-      <w:r>
-        <w:rPr>
-          <w:rFonts w:ascii="Times New Roman" w:hAnsi="Times New Roman"/>
-          <w:sz w:val="20"/>
-        </w:rPr>
-        <w:t xml:space="preserve"> (2014): a generator maps noise to samples while a discriminator scores how real they look, and the two train in competition under the non-saturating binary cross-entropy objective. Image data uses the convolutional DCGAN of Radford </w:t>
-      </w:r>
-      <w:r>
-        <w:rPr>
-          <w:rFonts w:ascii="Times New Roman" w:hAnsi="Times New Roman"/>
-          <w:i/>
-          <w:sz w:val="20"/>
-        </w:rPr>
-        <w:t>et al.</w:t>
-      </w:r>
-      <w:r>
-        <w:rPr>
-          <w:rFonts w:ascii="Times New Roman" w:hAnsi="Times New Roman"/>
-          <w:sz w:val="20"/>
-        </w:rPr>
-        <w:t xml:space="preserve"> (2016); tabular data uses a fully-connected variant. Throughout, the emphasis is on interpreting results rather than restating code.</w:t>
+        <w:t xml:space="preserve">Every model rests on the adversarial idea of Goodfellow et al. (2014): a generator maps noise to samples while a discriminator scores how real they look, and the two train in competition under the non-saturating binary cross-entropy objective. Image data uses the convolutional DCGAN of Radford et al. (2016), and tabular data uses a fully-connected variant. Throughout, the focus stays on interpreting the results, with the code left in the notebook.</w:t>
       </w:r>
     </w:p>
     <w:p>
@@ -169,38 +139,23 @@
           <w:rFonts w:ascii="Times New Roman" w:hAnsi="Times New Roman"/>
           <w:sz w:val="20"/>
         </w:rPr>
-        <w:t>2. Part 1: GANs Built From Scratch on 2D Data</w:t>
-      </w:r>
-    </w:p>
-    <w:p>
-      <w:pPr>
-        <w:jc w:val="both"/>
-        <w:rPr>
-          <w:rFonts w:ascii="Times New Roman" w:hAnsi="Times New Roman"/>
-          <w:sz w:val="20"/>
-        </w:rPr>
-      </w:pPr>
-      <w:r>
-        <w:rPr>
-          <w:rFonts w:ascii="Times New Roman" w:hAnsi="Times New Roman"/>
-          <w:sz w:val="20"/>
-        </w:rPr>
-        <w:t xml:space="preserve">Both networks are small MLPs trained with BCEWithLogitsLoss, one discriminator step per generator step, using Adam (2e-4, β = 0.5, 0.999) as recommended for GAN stability (Radford </w:t>
-      </w:r>
-      <w:r>
-        <w:rPr>
-          <w:rFonts w:ascii="Times New Roman" w:hAnsi="Times New Roman"/>
-          <w:i/>
-          <w:sz w:val="20"/>
-        </w:rPr>
-        <w:t>et al.</w:t>
-      </w:r>
-      <w:r>
-        <w:rPr>
-          <w:rFonts w:ascii="Times New Roman" w:hAnsi="Times New Roman"/>
-          <w:sz w:val="20"/>
-        </w:rPr>
-        <w:t>, 2016; Kingma and Ba, 2015). One configurable pair of classes serves all three tasks, so the Task 3 comparison is fair, only the changed hyper-parameters differ.</w:t>
+        <w:t>2. Part 1: GANs built from scratch on 2D data</w:t>
+      </w:r>
+    </w:p>
+    <w:p>
+      <w:pPr>
+        <w:jc w:val="both"/>
+        <w:rPr>
+          <w:rFonts w:ascii="Times New Roman" w:hAnsi="Times New Roman"/>
+          <w:sz w:val="20"/>
+        </w:rPr>
+      </w:pPr>
+      <w:r>
+        <w:rPr>
+          <w:rFonts w:ascii="Times New Roman" w:hAnsi="Times New Roman"/>
+          <w:sz w:val="20"/>
+        </w:rPr>
+        <w:t xml:space="preserve">Both networks are small MLPs trained with BCEWithLogitsLoss, one discriminator step per generator step, using Adam (2e-4, betas 0.5 and 0.999) as recommended for GAN stability (Radford et al., 2016; Kingma and Ba, 2015). One configurable pair of classes serves all three tasks, so the Task 3 comparison is fair, since only the changed hyper-parameters differ.</w:t>
       </w:r>
     </w:p>
     <w:p>
@@ -216,7 +171,7 @@
           <w:rFonts w:ascii="Times New Roman" w:hAnsi="Times New Roman"/>
           <w:sz w:val="20"/>
         </w:rPr>
-        <w:t>2.1 Task 1: Reproducing the Sine-Wave GAN</w:t>
+        <w:t>2.1 Task 1: reproducing the sine-wave GAN</w:t>
       </w:r>
     </w:p>
     <w:p>
@@ -348,8 +303,7 @@
           <w:rFonts w:ascii="Times New Roman" w:hAnsi="Times New Roman"/>
           <w:sz w:val="20"/>
         </w:rPr>
-        <w:lastRenderedPageBreak/>
-        <w:t>Figure 1 shows the generated cloud lying almost exactly on the curve, and the losses agree: the discriminator settles at 1.35-1.39 (final 1.3796) and the generator at 0.68-0.76 (final 0.6979), close to this objective's equilibrium (≈ 2ln2 = 1.386 for D, ln2 = 0.693 for G). Neither loss runs away, indicating genuine convergence rather than one network dominating.</w:t>
+        <w:t xml:space="preserve">Figure 1 shows the generated cloud lying almost exactly on the curve, and the losses agree: the discriminator settles at 1.35-1.39 (final 1.3796) and the generator at 0.68-0.76 (final 0.6979), close to this objective's equilibrium (about 2ln2 = 1.386 for D and ln2 = 0.693 for G). Neither loss runs away, which indicates genuine convergence with neither network dominating.</w:t>
       </w:r>
     </w:p>
     <w:p>
@@ -365,7 +319,7 @@
           <w:rFonts w:ascii="Times New Roman" w:hAnsi="Times New Roman"/>
           <w:sz w:val="20"/>
         </w:rPr>
-        <w:t>2.2 Task 2: A Noisy Parametric Curve</w:t>
+        <w:t>2.2 Task 2: a noisy parametric curve</w:t>
       </w:r>
     </w:p>
     <w:p>
@@ -512,7 +466,7 @@
           <w:rFonts w:ascii="Times New Roman" w:hAnsi="Times New Roman"/>
           <w:sz w:val="20"/>
         </w:rPr>
-        <w:t>Figure 2 shows the generator tracing the double-bump shape and spreading its points into the same noisy band as the real data rather than collapsing to a thin line, so it learns the target's variance and not just its mean trend. Losses stay healthy (D 1.1652-1.3705, G 0.7229-0.8429), a little noisier than Task 1 as expected for a more oscillatory target.</w:t>
+        <w:t xml:space="preserve">Figure 2 shows the generator tracing the double-bump shape and spreading its points into the same noisy band as the real data, so it captures both the mean trend of the target and its variance and does not collapse to a thin line. Losses stay healthy (D 1.1652-1.3705, G 0.7229-0.8429), a little noisier than Task 1 as expected for a more oscillatory target.</w:t>
       </w:r>
     </w:p>
     <w:p>
@@ -528,7 +482,7 @@
           <w:rFonts w:ascii="Times New Roman" w:hAnsi="Times New Roman"/>
           <w:sz w:val="20"/>
         </w:rPr>
-        <w:t>2.3 Task 3: Architecture Modification and Comparison</w:t>
+        <w:t>2.3 Task 3: architecture modification and comparison</w:t>
       </w:r>
     </w:p>
     <w:p>
@@ -630,8 +584,7 @@
           <w:rFonts w:ascii="Times New Roman" w:hAnsi="Times New Roman"/>
           <w:sz w:val="20"/>
         </w:rPr>
-        <w:lastRenderedPageBreak/>
-        <w:t>Figure 3 shows a visible but modest gain: the deeper ELU generator sits slightly tighter around the curve with fewer stray points, and its losses stay stable (final D 1.3821, G 0.7089), so the added depth caused no optimisation trouble. That the gain is small is itself informative, a 2D curve is simple enough that the shallow baseline already captures most of the structure.</w:t>
+        <w:t xml:space="preserve">Figure 3 shows a visible but modest gain: the deeper ELU generator sits slightly tighter around the curve with fewer stray points, and its losses stay stable (final D 1.3821, G 0.7089), so the added depth caused no optimisation trouble. That the gain is small is itself informative, because a 2D curve is simple enough that the shallow baseline already captures most of the structure.</w:t>
       </w:r>
     </w:p>
     <w:p>
@@ -647,7 +600,7 @@
           <w:rFonts w:ascii="Times New Roman" w:hAnsi="Times New Roman"/>
           <w:sz w:val="20"/>
         </w:rPr>
-        <w:t>3. Part 2: Applying GANs to Three Real-World Domains</w:t>
+        <w:t>3. Part 2: applying GANs to three real-world domains</w:t>
       </w:r>
     </w:p>
     <w:p>
@@ -663,76 +616,23 @@
           <w:rFonts w:ascii="Times New Roman" w:hAnsi="Times New Roman"/>
           <w:sz w:val="20"/>
         </w:rPr>
-        <w:t>3.1 Part 2.1: Retinal OCT Scans with OCTMNIST</w:t>
-      </w:r>
-    </w:p>
-    <w:p>
-      <w:pPr>
-        <w:jc w:val="both"/>
-        <w:rPr>
-          <w:rFonts w:ascii="Times New Roman" w:hAnsi="Times New Roman"/>
-          <w:sz w:val="20"/>
-        </w:rPr>
-      </w:pPr>
-      <w:r>
-        <w:rPr>
-          <w:rFonts w:ascii="Times New Roman" w:hAnsi="Times New Roman"/>
-          <w:b/>
-          <w:sz w:val="20"/>
-        </w:rPr>
-        <w:t>Dataset and approach.</w:t>
-      </w:r>
-      <w:r>
-        <w:rPr>
-          <w:rFonts w:ascii="Times New Roman" w:hAnsi="Times New Roman"/>
-          <w:sz w:val="20"/>
-        </w:rPr>
-        <w:t xml:space="preserve"> OCTMNIST (Yang </w:t>
-      </w:r>
-      <w:r>
-        <w:rPr>
-          <w:rFonts w:ascii="Times New Roman" w:hAnsi="Times New Roman"/>
-          <w:i/>
-          <w:sz w:val="20"/>
-        </w:rPr>
-        <w:t>et al.</w:t>
-      </w:r>
-      <w:r>
-        <w:rPr>
-          <w:rFonts w:ascii="Times New Roman" w:hAnsi="Times New Roman"/>
-          <w:sz w:val="20"/>
-        </w:rPr>
-        <w:t xml:space="preserve">, 2023) provides 97,477 training scans of 28×28 pixels in four diagnostic classes (choroidal neovascularisation, diabetic macular oedema, drusen, normal), rescaled to 32×32 in [-1, 1] to match the generator's tanh. A DCGAN (Radford </w:t>
-      </w:r>
-      <w:r>
-        <w:rPr>
-          <w:rFonts w:ascii="Times New Roman" w:hAnsi="Times New Roman"/>
-          <w:i/>
-          <w:sz w:val="20"/>
-        </w:rPr>
-        <w:t>et al.</w:t>
-      </w:r>
-      <w:r>
-        <w:rPr>
-          <w:rFonts w:ascii="Times New Roman" w:hAnsi="Times New Roman"/>
-          <w:sz w:val="20"/>
-        </w:rPr>
-        <w:t xml:space="preserve">, 2016) suits the strong local structure of a scan, a curved retinal band on a dark background, which convolutions capture far more efficiently than a dense network. The generator upsamples a 100-D latent vector via transposed convolutions; the discriminator mirrors it with strided convolutions and 0.3 dropout. Training used a manual tf.GradientTape loop for 35 epochs with one-sided label smoothing (real labels 0.9), which stops the discriminator over-confidently starving the generator of gradient (Salimans </w:t>
-      </w:r>
-      <w:r>
-        <w:rPr>
-          <w:rFonts w:ascii="Times New Roman" w:hAnsi="Times New Roman"/>
-          <w:i/>
-          <w:sz w:val="20"/>
-        </w:rPr>
-        <w:t>et al.</w:t>
-      </w:r>
-      <w:r>
-        <w:rPr>
-          <w:rFonts w:ascii="Times New Roman" w:hAnsi="Times New Roman"/>
-          <w:sz w:val="20"/>
-        </w:rPr>
-        <w:t>, 2016).</w:t>
+        <w:t>3.1 Part 2.1: retinal OCT scans with OCTMNIST</w:t>
+      </w:r>
+    </w:p>
+    <w:p>
+      <w:pPr>
+        <w:jc w:val="both"/>
+        <w:rPr>
+          <w:rFonts w:ascii="Times New Roman" w:hAnsi="Times New Roman"/>
+          <w:sz w:val="20"/>
+        </w:rPr>
+      </w:pPr>
+      <w:r>
+        <w:rPr>
+          <w:rFonts w:ascii="Times New Roman" w:hAnsi="Times New Roman"/>
+          <w:sz w:val="20"/>
+        </w:rPr>
+        <w:t xml:space="preserve">OCTMNIST (Yang et al., 2023) provides 97,477 training scans of 28x28 pixels in four diagnostic classes (choroidal neovascularisation, diabetic macular oedema, drusen, normal), rescaled to 32x32 in [-1, 1] to match the generator's tanh. A DCGAN (Radford et al., 2016) suits the strong local structure of a scan, a curved retinal band on a dark background, which convolutions capture far more efficiently than a dense network. The generator upsamples a 100-D latent vector via transposed convolutions, and the discriminator mirrors it with strided convolutions and 0.3 dropout. Training used a manual tf.GradientTape loop for 35 epochs with one-sided label smoothing (real labels 0.9), which stops the discriminator over-confidently starving the generator of gradient (Salimans et al., 2016).</w:t>
       </w:r>
     </w:p>
     <w:p>
@@ -904,7 +804,7 @@
           <w:rFonts w:ascii="Times New Roman" w:hAnsi="Times New Roman"/>
           <w:sz w:val="20"/>
         </w:rPr>
-        <w:t>Figure 5 shows neither network diverging, the discriminator stays around 0.9 to 1.55 and the generator around 0.4 to 1.66, oscillating within a stable band. That stability is what makes the sample quality below meaningful rather than accidental.</w:t>
+        <w:t xml:space="preserve">Figure 5 shows neither network diverging: the discriminator stays around 0.9 to 1.55 and the generator around 0.4 to 1.66, oscillating within a stable band. That stability is what makes the sample quality below a product of real learning.</w:t>
       </w:r>
     </w:p>
     <w:p>
@@ -1000,76 +900,23 @@
           <w:rFonts w:ascii="Times New Roman" w:hAnsi="Times New Roman"/>
           <w:sz w:val="20"/>
         </w:rPr>
-        <w:t xml:space="preserve">Figure 6 shows the generator reproduces the main anatomy with real variation in band position and curvature, so it is not memorising one image; its weakness is fine detail, the fakes are softer and lose sub-layer texture and speckle. It scores </w:t>
-      </w:r>
-      <w:r>
-        <w:rPr>
-          <w:rFonts w:ascii="Times New Roman" w:hAnsi="Times New Roman"/>
-          <w:b/>
-          <w:sz w:val="20"/>
-        </w:rPr>
-        <w:t>FID = 39.23</w:t>
-      </w:r>
-      <w:r>
-        <w:rPr>
-          <w:rFonts w:ascii="Times New Roman" w:hAnsi="Times New Roman"/>
-          <w:sz w:val="20"/>
-        </w:rPr>
-        <w:t xml:space="preserve"> (Heusel </w:t>
-      </w:r>
-      <w:r>
-        <w:rPr>
-          <w:rFonts w:ascii="Times New Roman" w:hAnsi="Times New Roman"/>
-          <w:i/>
-          <w:sz w:val="20"/>
-        </w:rPr>
-        <w:t>et al.</w:t>
-      </w:r>
-      <w:r>
-        <w:rPr>
-          <w:rFonts w:ascii="Times New Roman" w:hAnsi="Times New Roman"/>
-          <w:sz w:val="20"/>
-        </w:rPr>
-        <w:t xml:space="preserve">, 2017), a believable mid-range value for a 35-epoch DCGAN, though read cautiously: FID passes 28×28 greyscale (upscaled) through an ImageNet-trained InceptionV3 (Szegedy </w:t>
-      </w:r>
-      <w:r>
-        <w:rPr>
-          <w:rFonts w:ascii="Times New Roman" w:hAnsi="Times New Roman"/>
-          <w:i/>
-          <w:sz w:val="20"/>
-        </w:rPr>
-        <w:t>et al.</w:t>
-      </w:r>
-      <w:r>
-        <w:rPr>
-          <w:rFonts w:ascii="Times New Roman" w:hAnsi="Times New Roman"/>
-          <w:sz w:val="20"/>
-        </w:rPr>
-        <w:t>, 2016), a domain it was never calibrated for, so it is indicative rather than absolute.</w:t>
-      </w:r>
-    </w:p>
-    <w:p>
-      <w:pPr>
-        <w:jc w:val="both"/>
-        <w:rPr>
-          <w:rFonts w:ascii="Times New Roman" w:hAnsi="Times New Roman"/>
-          <w:sz w:val="20"/>
-        </w:rPr>
-      </w:pPr>
-      <w:r>
-        <w:rPr>
-          <w:rFonts w:ascii="Times New Roman" w:hAnsi="Times New Roman"/>
-          <w:b/>
-          <w:sz w:val="20"/>
-        </w:rPr>
-        <w:t>Extension: conditional GAN.</w:t>
-      </w:r>
-      <w:r>
-        <w:rPr>
-          <w:rFonts w:ascii="Times New Roman" w:hAnsi="Times New Roman"/>
-          <w:sz w:val="20"/>
-        </w:rPr>
-        <w:t xml:space="preserve"> The DCGAN was made conditional (Mirza and Osindero, 2014) by concatenating a class embedding onto the latent vector and feeding the label to the discriminator as an extra channel.</w:t>
+        <w:t xml:space="preserve">Figure 6 shows the generator reproduces the main anatomy with real variation in band position and curvature, so it is not memorising one image; its weakness is fine detail, since the fakes are softer and lose sub-layer texture and speckle. It scores FID = 39.23 (Heusel et al., 2017), a believable mid-range value for a 35-epoch DCGAN, though it should be read cautiously: FID passes 28x28 greyscale (upscaled) through an ImageNet-trained InceptionV3 (Szegedy et al., 2016), a domain it was never calibrated for, so the score is indicative only.</w:t>
+      </w:r>
+    </w:p>
+    <w:p>
+      <w:pPr>
+        <w:jc w:val="both"/>
+        <w:rPr>
+          <w:rFonts w:ascii="Times New Roman" w:hAnsi="Times New Roman"/>
+          <w:sz w:val="20"/>
+        </w:rPr>
+      </w:pPr>
+      <w:r>
+        <w:rPr>
+          <w:rFonts w:ascii="Times New Roman" w:hAnsi="Times New Roman"/>
+          <w:sz w:val="20"/>
+        </w:rPr>
+        <w:t xml:space="preserve">For class control, the DCGAN was made conditional (Mirza and Osindero, 2014) by concatenating a class embedding onto the latent vector and feeding the label to the discriminator as an extra channel.</w:t>
       </w:r>
     </w:p>
     <w:p>
@@ -1155,46 +1002,23 @@
           <w:rFonts w:ascii="Times New Roman" w:hAnsi="Times New Roman"/>
           <w:sz w:val="20"/>
         </w:rPr>
-        <w:t>Figure 7 shows visibly different scans per row, so the label steers the output rather than being ignored; better-represented classes look sharper, the direct effect of the imbalance in Figure 4.</w:t>
-      </w:r>
-    </w:p>
-    <w:p>
-      <w:pPr>
-        <w:jc w:val="both"/>
-        <w:rPr>
-          <w:rFonts w:ascii="Times New Roman" w:hAnsi="Times New Roman"/>
-          <w:sz w:val="20"/>
-        </w:rPr>
-      </w:pPr>
-      <w:r>
-        <w:rPr>
-          <w:rFonts w:ascii="Times New Roman" w:hAnsi="Times New Roman"/>
-          <w:b/>
-          <w:sz w:val="20"/>
-        </w:rPr>
-        <w:t>On GANs and "ducks".</w:t>
-      </w:r>
-      <w:r>
-        <w:rPr>
-          <w:rFonts w:ascii="Times New Roman" w:hAnsi="Times New Roman"/>
-          <w:sz w:val="20"/>
-        </w:rPr>
-        <w:t xml:space="preserve"> The duck test, if it looks and quacks like a duck, assume it is one, captures a real risk here. The discriminator only judges whether an image </w:t>
-      </w:r>
-      <w:r>
-        <w:rPr>
-          <w:rFonts w:ascii="Times New Roman" w:hAnsi="Times New Roman"/>
-          <w:i/>
-          <w:sz w:val="20"/>
-        </w:rPr>
-        <w:t>looks</w:t>
-      </w:r>
-      <w:r>
-        <w:rPr>
-          <w:rFonts w:ascii="Times New Roman" w:hAnsi="Times New Roman"/>
-          <w:sz w:val="20"/>
-        </w:rPr>
-        <w:t xml:space="preserve"> real, never whether it is anatomically correct, so nothing stops the generator inventing convincing structure that matches no real scan (a bright region reading as pathology, or a smoothed-over feature). Synthetic OCT images are therefore fine for augmentation or teaching but never diagnostic ground truth, and any model trained on mixed data should be re-validated on real-only data.</w:t>
+        <w:t xml:space="preserve">Figure 7 shows visibly different scans per row, so the label steers the output and is not ignored; better-represented classes look sharper, which is the direct effect of the imbalance in Figure 4.</w:t>
+      </w:r>
+    </w:p>
+    <w:p>
+      <w:pPr>
+        <w:jc w:val="both"/>
+        <w:rPr>
+          <w:rFonts w:ascii="Times New Roman" w:hAnsi="Times New Roman"/>
+          <w:sz w:val="20"/>
+        </w:rPr>
+      </w:pPr>
+      <w:r>
+        <w:rPr>
+          <w:rFonts w:ascii="Times New Roman" w:hAnsi="Times New Roman"/>
+          <w:sz w:val="20"/>
+        </w:rPr>
+        <w:t xml:space="preserve">The duck test, if it looks and quacks like a duck then assume it is one, captures a real risk here. The discriminator only judges whether an image looks real, never whether it is anatomically correct, so nothing stops the generator inventing convincing structure that matches no real scan, such as a bright region reading as pathology or a smoothed-over feature. Synthetic OCT images are therefore fine for augmentation or teaching but never diagnostic ground truth, and any model trained on mixed data should be re-validated on real-only data.</w:t>
       </w:r>
     </w:p>
     <w:p>
@@ -1210,76 +1034,23 @@
           <w:rFonts w:ascii="Times New Roman" w:hAnsi="Times New Roman"/>
           <w:sz w:val="20"/>
         </w:rPr>
-        <w:t>3.2 Part 2.2: Network-Traffic Synthesis with CICIDS 2017</w:t>
-      </w:r>
-    </w:p>
-    <w:p>
-      <w:pPr>
-        <w:jc w:val="both"/>
-        <w:rPr>
-          <w:rFonts w:ascii="Times New Roman" w:hAnsi="Times New Roman"/>
-          <w:sz w:val="20"/>
-        </w:rPr>
-      </w:pPr>
-      <w:r>
-        <w:rPr>
-          <w:rFonts w:ascii="Times New Roman" w:hAnsi="Times New Roman"/>
-          <w:b/>
-          <w:sz w:val="20"/>
-        </w:rPr>
-        <w:t>Dataset and approach.</w:t>
-      </w:r>
-      <w:r>
-        <w:rPr>
-          <w:rFonts w:ascii="Times New Roman" w:hAnsi="Times New Roman"/>
-          <w:sz w:val="20"/>
-        </w:rPr>
-        <w:t xml:space="preserve"> CICIDS 2017 (Sharafaldin </w:t>
-      </w:r>
-      <w:r>
-        <w:rPr>
-          <w:rFonts w:ascii="Times New Roman" w:hAnsi="Times New Roman"/>
-          <w:i/>
-          <w:sz w:val="20"/>
-        </w:rPr>
-        <w:t>et al.</w:t>
-      </w:r>
-      <w:r>
-        <w:rPr>
-          <w:rFonts w:ascii="Times New Roman" w:hAnsi="Times New Roman"/>
-          <w:sz w:val="20"/>
-        </w:rPr>
-        <w:t xml:space="preserve">, 2018) was pulled via kagglehub and its eight daily files combined into </w:t>
-      </w:r>
-      <w:r>
-        <w:rPr>
-          <w:rFonts w:ascii="Times New Roman" w:hAnsi="Times New Roman"/>
-          <w:b/>
-          <w:sz w:val="20"/>
-        </w:rPr>
-        <w:t>2,830,743 flows × 80 columns</w:t>
-      </w:r>
-      <w:r>
-        <w:rPr>
-          <w:rFonts w:ascii="Times New Roman" w:hAnsi="Times New Roman"/>
-          <w:sz w:val="20"/>
-        </w:rPr>
-        <w:t xml:space="preserve"> (</w:t>
-      </w:r>
-      <w:r>
-        <w:rPr>
-          <w:rFonts w:ascii="Times New Roman" w:hAnsi="Times New Roman"/>
-          <w:b/>
-          <w:sz w:val="20"/>
-        </w:rPr>
-        <w:t>78 numeric features</w:t>
-      </w:r>
-      <w:r>
-        <w:rPr>
-          <w:rFonts w:ascii="Times New Roman" w:hAnsi="Times New Roman"/>
-          <w:sz w:val="20"/>
-        </w:rPr>
-        <w:t>). Because each flow is a feature vector, a dense GAN replaces the DCGAN, there is no spatial axis for convolutions. The generator widens 128→256 (batch norm, ReLU) ending in a linear layer (standardised features are unbounded, so no tanh); the discriminator narrows 256→128 (LeakyReLU, dropout). Latent dimension 48, 60 epochs.</w:t>
+        <w:t>3.2 Part 2.2: network-traffic synthesis with CICIDS 2017</w:t>
+      </w:r>
+    </w:p>
+    <w:p>
+      <w:pPr>
+        <w:jc w:val="both"/>
+        <w:rPr>
+          <w:rFonts w:ascii="Times New Roman" w:hAnsi="Times New Roman"/>
+          <w:sz w:val="20"/>
+        </w:rPr>
+      </w:pPr>
+      <w:r>
+        <w:rPr>
+          <w:rFonts w:ascii="Times New Roman" w:hAnsi="Times New Roman"/>
+          <w:sz w:val="20"/>
+        </w:rPr>
+        <w:t xml:space="preserve">CICIDS 2017 (Sharafaldin et al., 2018) was pulled via kagglehub and its eight daily files combined into 2,830,743 flows across 80 columns (78 numeric features). Because each flow is a feature vector, a dense GAN replaces the DCGAN, as there is no spatial axis for convolutions. The generator widens 128 to 256 (batch norm, ReLU) and ends in a linear layer, since standardised features are unbounded and a tanh would clip them; the discriminator narrows 256 to 128 (LeakyReLU, dropout). The latent dimension is 48 and training runs 60 epochs.</w:t>
       </w:r>
     </w:p>
     <w:p>
@@ -1366,22 +1137,7 @@
           <w:rFonts w:ascii="Times New Roman" w:hAnsi="Times New Roman"/>
           <w:sz w:val="20"/>
         </w:rPr>
-        <w:t xml:space="preserve">Figure 8 shows severe imbalance: BENIGN dominates at 2,273,097 flows while Heartbleed (11), SQL Injection (21) and Infiltration (36) barely appear, hence the log scale. Per the brief, the model trained on the </w:t>
-      </w:r>
-      <w:r>
-        <w:rPr>
-          <w:rFonts w:ascii="Times New Roman" w:hAnsi="Times New Roman"/>
-          <w:b/>
-          <w:sz w:val="20"/>
-        </w:rPr>
-        <w:t>Wednesday file only</w:t>
-      </w:r>
-      <w:r>
-        <w:rPr>
-          <w:rFonts w:ascii="Times New Roman" w:hAnsi="Times New Roman"/>
-          <w:sz w:val="20"/>
-        </w:rPr>
-        <w:t xml:space="preserve"> (691,406 rows: 440,031 BENIGN plus DoS Hulk, GoldenEye, slowloris and Slowhttptest) using a sampled 20,000 rows, standardised and clipped to ±5σ to stop extreme outliers (and 4,376 infinite, 1,358 missing values) destabilising training.</w:t>
+        <w:t xml:space="preserve">Figure 8 shows severe imbalance: BENIGN dominates at 2,273,097 flows while Heartbleed (11), SQL Injection (21) and Infiltration (36) barely appear, hence the log scale. Following the brief, the model trained on the Wednesday file only (691,406 rows: 440,031 BENIGN plus DoS Hulk, GoldenEye, slowloris and Slowhttptest), using a sampled 20,000 rows, standardised and clipped to plus or minus 5 sigma so that extreme outliers (and 4,376 infinite and 1,358 missing values) do not destabilise training.</w:t>
       </w:r>
     </w:p>
     <w:p>
@@ -1624,130 +1380,39 @@
           <w:rFonts w:ascii="Times New Roman" w:hAnsi="Times New Roman"/>
           <w:sz w:val="20"/>
         </w:rPr>
-        <w:t xml:space="preserve">Figures 10 and 11 agree: in both the linear PCA and non-linear t-SNE views (van der Maaten and Hinton, 2008) the synthetic points sit inside the main mass of real traffic rather than forming a separate blob, so the generator found the right region of feature space. However, the synthetic cloud is tighter than the real one and misses the tails. The alignment gaps quantify this, mean absolute per-feature error of </w:t>
-      </w:r>
-      <w:r>
-        <w:rPr>
-          <w:rFonts w:ascii="Times New Roman" w:hAnsi="Times New Roman"/>
-          <w:b/>
-          <w:sz w:val="20"/>
-        </w:rPr>
-        <w:t>0.1576</w:t>
-      </w:r>
-      <w:r>
-        <w:rPr>
-          <w:rFonts w:ascii="Times New Roman" w:hAnsi="Times New Roman"/>
-          <w:sz w:val="20"/>
-        </w:rPr>
-        <w:t xml:space="preserve"> for means and </w:t>
-      </w:r>
-      <w:r>
-        <w:rPr>
-          <w:rFonts w:ascii="Times New Roman" w:hAnsi="Times New Roman"/>
-          <w:b/>
-          <w:sz w:val="20"/>
-        </w:rPr>
-        <w:t>0.2067</w:t>
-      </w:r>
-      <w:r>
-        <w:rPr>
-          <w:rFonts w:ascii="Times New Roman" w:hAnsi="Times New Roman"/>
-          <w:sz w:val="20"/>
-        </w:rPr>
-        <w:t xml:space="preserve"> for standard deviations, so averages are matched well but spread is understated.</w:t>
-      </w:r>
-    </w:p>
-    <w:p>
-      <w:pPr>
-        <w:jc w:val="both"/>
-        <w:rPr>
-          <w:rFonts w:ascii="Times New Roman" w:hAnsi="Times New Roman"/>
-          <w:sz w:val="20"/>
-        </w:rPr>
-      </w:pPr>
-      <w:r>
-        <w:rPr>
-          <w:rFonts w:ascii="Times New Roman" w:hAnsi="Times New Roman"/>
-          <w:b/>
-          <w:sz w:val="20"/>
-        </w:rPr>
-        <w:t>Extension: full multi-day dataset.</w:t>
-      </w:r>
-      <w:r>
-        <w:rPr>
-          <w:rFonts w:ascii="Times New Roman" w:hAnsi="Times New Roman"/>
-          <w:sz w:val="20"/>
-        </w:rPr>
-        <w:t xml:space="preserve"> Retraining on 30,000 rows from all eight days </w:t>
-      </w:r>
-      <w:r>
-        <w:rPr>
-          <w:rFonts w:ascii="Times New Roman" w:hAnsi="Times New Roman"/>
-          <w:i/>
-          <w:sz w:val="20"/>
-        </w:rPr>
-        <w:t>improved</w:t>
-      </w:r>
-      <w:r>
-        <w:rPr>
-          <w:rFonts w:ascii="Times New Roman" w:hAnsi="Times New Roman"/>
-          <w:sz w:val="20"/>
-        </w:rPr>
-        <w:t xml:space="preserve"> both gaps (</w:t>
-      </w:r>
-      <w:r>
-        <w:rPr>
-          <w:rFonts w:ascii="Times New Roman" w:hAnsi="Times New Roman"/>
-          <w:b/>
-          <w:sz w:val="20"/>
-        </w:rPr>
-        <w:t>0.1300</w:t>
-      </w:r>
-      <w:r>
-        <w:rPr>
-          <w:rFonts w:ascii="Times New Roman" w:hAnsi="Times New Roman"/>
-          <w:sz w:val="20"/>
-        </w:rPr>
-        <w:t xml:space="preserve"> / </w:t>
-      </w:r>
-      <w:r>
-        <w:rPr>
-          <w:rFonts w:ascii="Times New Roman" w:hAnsi="Times New Roman"/>
-          <w:b/>
-          <w:sz w:val="20"/>
-        </w:rPr>
-        <w:t>0.1483</w:t>
-      </w:r>
-      <w:r>
-        <w:rPr>
-          <w:rFonts w:ascii="Times New Roman" w:hAnsi="Times New Roman"/>
-          <w:sz w:val="20"/>
-        </w:rPr>
-        <w:t xml:space="preserve"> versus 0.1576 / 0.2067). A single unconditional generator would usually fit worse across many attack families, so the extra data volume appears to offset the added diversity; the model still leans towards BENIGN and the high-volume attacks, and the rare classes stay under-represented. Note the brief's "DDoS" label, Wednesday's attacks are single-source DoS, and true DDoS only appears in the Friday file, which is included here.</w:t>
-      </w:r>
-    </w:p>
-    <w:p>
-      <w:pPr>
-        <w:jc w:val="both"/>
-        <w:rPr>
-          <w:rFonts w:ascii="Times New Roman" w:hAnsi="Times New Roman"/>
-          <w:sz w:val="20"/>
-        </w:rPr>
-      </w:pPr>
-      <w:r>
-        <w:rPr>
-          <w:rFonts w:ascii="Times New Roman" w:hAnsi="Times New Roman"/>
-          <w:b/>
-          <w:sz w:val="20"/>
-        </w:rPr>
-        <w:t>On "ducks".</w:t>
-      </w:r>
-      <w:r>
-        <w:rPr>
-          <w:rFonts w:ascii="Times New Roman" w:hAnsi="Times New Roman"/>
-          <w:sz w:val="20"/>
-        </w:rPr>
-        <w:t xml:space="preserve"> The duck test bites harder on tabular data: a generated flow only has to look statistically like traffic, not behave like a real attack. Used to augment an intrusion-detection set, a fake "attack" matching no real signature could teach the wrong pattern and miss real attacks, while a drifting "benign" row could raise false alarms. Since 78 numbers cannot be eyeballed like an image, the per-feature gaps, especially the standard-deviation gap where such drift shows first, are the main safeguard.</w:t>
+        <w:t xml:space="preserve">Figures 10 and 11 agree: in both the linear PCA and non-linear t-SNE views (van der Maaten and Hinton, 2008) the synthetic points sit inside the main mass of real traffic and do not form a separate blob, so the generator found the right region of feature space. Even so, the synthetic cloud is tighter than the real one and misses the tails. The alignment gaps quantify this, with a mean absolute per-feature error of 0.1576 for the means and 0.2067 for the standard deviations, so averages are matched well while spread is understated.</w:t>
+      </w:r>
+    </w:p>
+    <w:p>
+      <w:pPr>
+        <w:jc w:val="both"/>
+        <w:rPr>
+          <w:rFonts w:ascii="Times New Roman" w:hAnsi="Times New Roman"/>
+          <w:sz w:val="20"/>
+        </w:rPr>
+      </w:pPr>
+      <w:r>
+        <w:rPr>
+          <w:rFonts w:ascii="Times New Roman" w:hAnsi="Times New Roman"/>
+          <w:sz w:val="20"/>
+        </w:rPr>
+        <w:t xml:space="preserve">Retraining on 30,000 rows from all eight days improved both gaps (0.1300 / 0.1483 against 0.1576 / 0.2067). A single unconditional generator would usually fit worse across many attack families, so the extra data volume appears to offset the added diversity; the model still leans towards BENIGN and the high-volume attacks, and the rare classes stay under-represented. On the brief's 'DDoS' label, Wednesday's attacks are single-source DoS, and true DDoS only appears in the Friday file, which is included here.</w:t>
+      </w:r>
+    </w:p>
+    <w:p>
+      <w:pPr>
+        <w:jc w:val="both"/>
+        <w:rPr>
+          <w:rFonts w:ascii="Times New Roman" w:hAnsi="Times New Roman"/>
+          <w:sz w:val="20"/>
+        </w:rPr>
+      </w:pPr>
+      <w:r>
+        <w:rPr>
+          <w:rFonts w:ascii="Times New Roman" w:hAnsi="Times New Roman"/>
+          <w:sz w:val="20"/>
+        </w:rPr>
+        <w:t xml:space="preserve">The duck test bites harder on tabular data: a generated flow only has to look statistically like traffic, and need not behave like a real attack. Used to augment an intrusion-detection set, a fake 'attack' matching no real signature could teach the wrong pattern and miss real attacks, while a drifting 'benign' row could raise false alarms. Since 78 numbers cannot be eyeballed like an image, the per-feature gaps, especially the standard-deviation gap where such drift shows first, are the main safeguard.</w:t>
       </w:r>
     </w:p>
     <w:p>
@@ -1763,76 +1428,23 @@
           <w:rFonts w:ascii="Times New Roman" w:hAnsi="Times New Roman"/>
           <w:sz w:val="20"/>
         </w:rPr>
-        <w:t>3.3 Part 2.3: Sketch Generation with QuickDraw 'birthday cake'</w:t>
-      </w:r>
-    </w:p>
-    <w:p>
-      <w:pPr>
-        <w:jc w:val="both"/>
-        <w:rPr>
-          <w:rFonts w:ascii="Times New Roman" w:hAnsi="Times New Roman"/>
-          <w:sz w:val="20"/>
-        </w:rPr>
-      </w:pPr>
-      <w:r>
-        <w:rPr>
-          <w:rFonts w:ascii="Times New Roman" w:hAnsi="Times New Roman"/>
-          <w:b/>
-          <w:sz w:val="20"/>
-        </w:rPr>
-        <w:t>Dataset and approach.</w:t>
-      </w:r>
-      <w:r>
-        <w:rPr>
-          <w:rFonts w:ascii="Times New Roman" w:hAnsi="Times New Roman"/>
-          <w:sz w:val="20"/>
-        </w:rPr>
-        <w:t xml:space="preserve"> The QuickDraw </w:t>
-      </w:r>
-      <w:r>
-        <w:rPr>
-          <w:rFonts w:ascii="Times New Roman" w:hAnsi="Times New Roman"/>
-          <w:i/>
-          <w:sz w:val="20"/>
-        </w:rPr>
-        <w:t>birthday cake</w:t>
-      </w:r>
-      <w:r>
-        <w:rPr>
-          <w:rFonts w:ascii="Times New Roman" w:hAnsi="Times New Roman"/>
-          <w:sz w:val="20"/>
-        </w:rPr>
-        <w:t xml:space="preserve"> set (Ha and Eck, 2018) provides </w:t>
-      </w:r>
-      <w:r>
-        <w:rPr>
-          <w:rFonts w:ascii="Times New Roman" w:hAnsi="Times New Roman"/>
-          <w:b/>
-          <w:sz w:val="20"/>
-        </w:rPr>
-        <w:t>144,982</w:t>
-      </w:r>
-      <w:r>
-        <w:rPr>
-          <w:rFonts w:ascii="Times New Roman" w:hAnsi="Times New Roman"/>
-          <w:sz w:val="20"/>
-        </w:rPr>
-        <w:t xml:space="preserve"> 28×28 bitmaps. A PyTorch DCGAN with a 128-D latent vector trained for 30 epochs, using the DCGAN weight initialisation of Radford </w:t>
-      </w:r>
-      <w:r>
-        <w:rPr>
-          <w:rFonts w:ascii="Times New Roman" w:hAnsi="Times New Roman"/>
-          <w:i/>
-          <w:sz w:val="20"/>
-        </w:rPr>
-        <w:t>et al.</w:t>
-      </w:r>
-      <w:r>
-        <w:rPr>
-          <w:rFonts w:ascii="Times New Roman" w:hAnsi="Times New Roman"/>
-          <w:sz w:val="20"/>
-        </w:rPr>
-        <w:t xml:space="preserve"> (2016) and label smoothing; a convolutional model suits the local stroke structure.</w:t>
+        <w:t>3.3 Part 2.3: sketch generation with QuickDraw 'birthday cake'</w:t>
+      </w:r>
+    </w:p>
+    <w:p>
+      <w:pPr>
+        <w:jc w:val="both"/>
+        <w:rPr>
+          <w:rFonts w:ascii="Times New Roman" w:hAnsi="Times New Roman"/>
+          <w:sz w:val="20"/>
+        </w:rPr>
+      </w:pPr>
+      <w:r>
+        <w:rPr>
+          <w:rFonts w:ascii="Times New Roman" w:hAnsi="Times New Roman"/>
+          <w:sz w:val="20"/>
+        </w:rPr>
+        <w:t xml:space="preserve">The QuickDraw birthday cake set (Ha and Eck, 2018) provides 144,982 bitmaps of 28x28 pixels. A PyTorch DCGAN with a 128-D latent vector trained for 30 epochs, using the DCGAN weight initialisation of Radford et al. (2016) and label smoothing; a convolutional model suits the local stroke structure.</w:t>
       </w:r>
     </w:p>
     <w:p>
@@ -1928,76 +1540,23 @@
           <w:rFonts w:ascii="Times New Roman" w:hAnsi="Times New Roman"/>
           <w:sz w:val="20"/>
         </w:rPr>
-        <w:t xml:space="preserve">Figure 12 shows the generated cakes are clearly recognisable, a body shape with candle-like marks on top, some with a plate or base line, though a few have broken strokes or speckle. The silhouette is consistent across the grid with no mode collapse. Training was stable apart from a brief epoch-13 spike (D 1.633, G 11.493) that recovered, and it scored </w:t>
-      </w:r>
-      <w:r>
-        <w:rPr>
-          <w:rFonts w:ascii="Times New Roman" w:hAnsi="Times New Roman"/>
-          <w:b/>
-          <w:sz w:val="20"/>
-        </w:rPr>
-        <w:t>FID = 34.29</w:t>
-      </w:r>
-      <w:r>
-        <w:rPr>
-          <w:rFonts w:ascii="Times New Roman" w:hAnsi="Times New Roman"/>
-          <w:sz w:val="20"/>
-        </w:rPr>
-        <w:t>.</w:t>
-      </w:r>
-    </w:p>
-    <w:p>
-      <w:pPr>
-        <w:jc w:val="both"/>
-        <w:rPr>
-          <w:rFonts w:ascii="Times New Roman" w:hAnsi="Times New Roman"/>
-          <w:sz w:val="20"/>
-        </w:rPr>
-      </w:pPr>
-      <w:r>
-        <w:rPr>
-          <w:rFonts w:ascii="Times New Roman" w:hAnsi="Times New Roman"/>
-          <w:b/>
-          <w:sz w:val="20"/>
-        </w:rPr>
-        <w:t>Extension: other categories and complexity.</w:t>
-      </w:r>
-      <w:r>
-        <w:rPr>
-          <w:rFonts w:ascii="Times New Roman" w:hAnsi="Times New Roman"/>
-          <w:sz w:val="20"/>
-        </w:rPr>
-        <w:t xml:space="preserve"> The same pipeline ran on </w:t>
-      </w:r>
-      <w:r>
-        <w:rPr>
-          <w:rFonts w:ascii="Times New Roman" w:hAnsi="Times New Roman"/>
-          <w:i/>
-          <w:sz w:val="20"/>
-        </w:rPr>
-        <w:t>cat</w:t>
-      </w:r>
-      <w:r>
-        <w:rPr>
-          <w:rFonts w:ascii="Times New Roman" w:hAnsi="Times New Roman"/>
-          <w:sz w:val="20"/>
-        </w:rPr>
-        <w:t xml:space="preserve"> and </w:t>
-      </w:r>
-      <w:r>
-        <w:rPr>
-          <w:rFonts w:ascii="Times New Roman" w:hAnsi="Times New Roman"/>
-          <w:i/>
-          <w:sz w:val="20"/>
-        </w:rPr>
-        <w:t>house</w:t>
-      </w:r>
-      <w:r>
-        <w:rPr>
-          <w:rFonts w:ascii="Times New Roman" w:hAnsi="Times New Roman"/>
-          <w:sz w:val="20"/>
-        </w:rPr>
-        <w:t>, comparing FID against an ink-density complexity proxy.</w:t>
+        <w:t xml:space="preserve">Figure 12 shows the generated cakes are clearly recognisable: a body shape with candle-like marks on top, some with a plate or base line, though a few have broken strokes or speckle. The silhouette is consistent across the grid with no mode collapse. Training was stable apart from a brief epoch-13 spike (D 1.633, G 11.493) that recovered, and it scored FID = 34.29.</w:t>
+      </w:r>
+    </w:p>
+    <w:p>
+      <w:pPr>
+        <w:jc w:val="both"/>
+        <w:rPr>
+          <w:rFonts w:ascii="Times New Roman" w:hAnsi="Times New Roman"/>
+          <w:sz w:val="20"/>
+        </w:rPr>
+      </w:pPr>
+      <w:r>
+        <w:rPr>
+          <w:rFonts w:ascii="Times New Roman" w:hAnsi="Times New Roman"/>
+          <w:sz w:val="20"/>
+        </w:rPr>
+        <w:t xml:space="preserve">The same pipeline ran on cat and house, comparing FID against an ink-density complexity proxy.</w:t>
       </w:r>
     </w:p>
     <w:p>
@@ -2083,52 +1642,7 @@
           <w:rFonts w:ascii="Times New Roman" w:hAnsi="Times New Roman"/>
           <w:sz w:val="20"/>
         </w:rPr>
-        <w:t>Figure 13 orders ink density as house (0.1725) &lt; cat (0.1986) &lt; cake (0.1989) and FID as house (</w:t>
-      </w:r>
-      <w:r>
-        <w:rPr>
-          <w:rFonts w:ascii="Times New Roman" w:hAnsi="Times New Roman"/>
-          <w:b/>
-          <w:sz w:val="20"/>
-        </w:rPr>
-        <w:t>26.44</w:t>
-      </w:r>
-      <w:r>
-        <w:rPr>
-          <w:rFonts w:ascii="Times New Roman" w:hAnsi="Times New Roman"/>
-          <w:sz w:val="20"/>
-        </w:rPr>
-        <w:t>) &lt; cake (</w:t>
-      </w:r>
-      <w:r>
-        <w:rPr>
-          <w:rFonts w:ascii="Times New Roman" w:hAnsi="Times New Roman"/>
-          <w:b/>
-          <w:sz w:val="20"/>
-        </w:rPr>
-        <w:t>34.29</w:t>
-      </w:r>
-      <w:r>
-        <w:rPr>
-          <w:rFonts w:ascii="Times New Roman" w:hAnsi="Times New Roman"/>
-          <w:sz w:val="20"/>
-        </w:rPr>
-        <w:t>) &lt; cat (</w:t>
-      </w:r>
-      <w:r>
-        <w:rPr>
-          <w:rFonts w:ascii="Times New Roman" w:hAnsi="Times New Roman"/>
-          <w:b/>
-          <w:sz w:val="20"/>
-        </w:rPr>
-        <w:t>38.79</w:t>
-      </w:r>
-      <w:r>
-        <w:rPr>
-          <w:rFonts w:ascii="Times New Roman" w:hAnsi="Times New Roman"/>
-          <w:sz w:val="20"/>
-        </w:rPr>
-        <w:t>). The sparsest category (house) is the easiest, supporting the idea that emptier sketches are simpler; but cat and cake have near-identical ink density while cat scores worse, so ink alone does not explain difficulty. Cat sketches vary far more in pose and detail (ears, whiskers, body angle), and it is that structural variety, not ink volume, that makes the category harder.</w:t>
+        <w:t xml:space="preserve">Figure 13 orders ink density as house (0.1725) &lt; cat (0.1986) &lt; cake (0.1989) and FID as house (26.44) &lt; cake (34.29) &lt; cat (38.79). The sparsest category, house, is the easiest, which supports the idea that emptier sketches are simpler. Cat and cake have near-identical ink density yet cat scores worse, so ink alone does not explain difficulty. Cat sketches vary far more in pose and detail such as ears, whiskers and body angle, and that structural variety, more than ink volume, is what makes the category harder.</w:t>
       </w:r>
     </w:p>
     <w:p>
@@ -2144,39 +1658,39 @@
           <w:rFonts w:ascii="Times New Roman" w:hAnsi="Times New Roman"/>
           <w:sz w:val="20"/>
         </w:rPr>
-        <w:t>4. Reflections and Future Directions</w:t>
-      </w:r>
-    </w:p>
-    <w:p>
-      <w:pPr>
-        <w:jc w:val="both"/>
-        <w:rPr>
-          <w:rFonts w:ascii="Times New Roman" w:hAnsi="Times New Roman"/>
-          <w:sz w:val="20"/>
-        </w:rPr>
-      </w:pPr>
-      <w:r>
-        <w:rPr>
-          <w:rFonts w:ascii="Times New Roman" w:hAnsi="Times New Roman"/>
-          <w:sz w:val="20"/>
-        </w:rPr>
-        <w:t>The same non-saturating objective was applied throughout, but the architecture was matched to the data each time: dense MLPs for 2D points and tabular traffic, convolutional DCGANs for images and sketches, and a conditional variant for class control. The from-scratch models reached near-theoretical equilibria; the DCGANs produced recognisable OCT scans (FID 39.23) and cake sketches (FID 34.29); and the tabular GAN placed synthetic flows within the real distribution (gaps 0.1576 / 0.2067, improving to 0.1300 / 0.1483 across all days). The recurring limitation is under-dispersion, central tendency is reproduced more faithfully than variance and fine detail, together with uneven quality on rare classes.</w:t>
-      </w:r>
-    </w:p>
-    <w:p>
-      <w:pPr>
-        <w:jc w:val="both"/>
-        <w:rPr>
-          <w:rFonts w:ascii="Times New Roman" w:hAnsi="Times New Roman"/>
-          <w:sz w:val="20"/>
-        </w:rPr>
-      </w:pPr>
-      <w:r>
-        <w:rPr>
-          <w:rFonts w:ascii="Times New Roman" w:hAnsi="Times New Roman"/>
-          <w:sz w:val="20"/>
-        </w:rPr>
-        <w:t>Future work follows from these weaknesses: conditioning the CICIDS generator on attack family (as done for OCT) would help it serve rare classes rather than defaulting to BENIGN; a Wasserstein objective with gradient penalty should improve tail coverage and the std-gap; and a domain-appropriate feature extractor would give a fairer image score than ImageNet InceptionV3. Above all, the duck-test analysis means any downstream use of this synthetic data, medical augmentation or intrusion-detection training, must be validated against real-only data before it is trusted.</w:t>
+        <w:t>4. Reflections and future directions</w:t>
+      </w:r>
+    </w:p>
+    <w:p>
+      <w:pPr>
+        <w:jc w:val="both"/>
+        <w:rPr>
+          <w:rFonts w:ascii="Times New Roman" w:hAnsi="Times New Roman"/>
+          <w:sz w:val="20"/>
+        </w:rPr>
+      </w:pPr>
+      <w:r>
+        <w:rPr>
+          <w:rFonts w:ascii="Times New Roman" w:hAnsi="Times New Roman"/>
+          <w:sz w:val="20"/>
+        </w:rPr>
+        <w:t xml:space="preserve">The same non-saturating objective was applied throughout, while the architecture was matched to the data each time: dense MLPs for 2D points and tabular traffic, convolutional DCGANs for images and sketches, and a conditional variant for class control. The from-scratch models reached near-theoretical equilibria; the DCGANs produced recognisable OCT scans (FID 39.23) and cake sketches (FID 34.29); and the tabular GAN placed synthetic flows within the real distribution (gaps 0.1576 / 0.2067, improving to 0.1300 / 0.1483 across all days). The recurring limitation is under-dispersion, where central tendency is reproduced more faithfully than variance and fine detail, together with uneven quality on rare classes.</w:t>
+      </w:r>
+    </w:p>
+    <w:p>
+      <w:pPr>
+        <w:jc w:val="both"/>
+        <w:rPr>
+          <w:rFonts w:ascii="Times New Roman" w:hAnsi="Times New Roman"/>
+          <w:sz w:val="20"/>
+        </w:rPr>
+      </w:pPr>
+      <w:r>
+        <w:rPr>
+          <w:rFonts w:ascii="Times New Roman" w:hAnsi="Times New Roman"/>
+          <w:sz w:val="20"/>
+        </w:rPr>
+        <w:t xml:space="preserve">Future work follows from these weaknesses. Conditioning the CICIDS generator on attack family, as done for OCT, would help it serve rare classes so it need not default to BENIGN; a Wasserstein objective with gradient penalty should improve tail coverage and the std-gap; and a domain-appropriate feature extractor would give a fairer image score than ImageNet InceptionV3. Above all, the duck-test analysis means any downstream use of this synthetic data, whether medical augmentation or intrusion-detection training, must be validated against real-only data before it is trusted.</w:t>
       </w:r>
     </w:p>
     <w:p>

</xml_diff>